<commit_message>
Agrega capturas de ejecución y versión PDF del reporte
- Capturas del Collection Runner, environment y Pytest en docs/capturas
- Reporte con portada completa, figuras y resultados del Runner
- Hallazgo sobre el bloqueo de Cloudflare al usar el Cloud Agent
- Exportación del reporte a PDF
</commit_message>
<xml_diff>
--- a/docs/Reporte_Laboratorio_7.docx
+++ b/docs/Reporte_Laboratorio_7.docx
@@ -80,15 +80,14 @@
       <w:r>
         <w:rPr>
           <w:b/>
-          <w:i w:val="0"/>
         </w:rPr>
-        <w:t xml:space="preserve">Integrantes: </w:t>
+        <w:t xml:space="preserve">Integrante: </w:t>
       </w:r>
       <w:r>
         <w:rPr>
-          <w:highlight w:val="yellow"/>
+          <w:b w:val="0"/>
         </w:rPr>
-        <w:t>[Nombre integrante 1] - [Nombre integrante 2]</w:t>
+        <w:t>Josué Calderón</w:t>
       </w:r>
     </w:p>
     <w:p>
@@ -98,15 +97,14 @@
       <w:r>
         <w:rPr>
           <w:b/>
-          <w:i w:val="0"/>
         </w:rPr>
         <w:t xml:space="preserve">Curso: </w:t>
       </w:r>
       <w:r>
         <w:rPr>
-          <w:highlight w:val="yellow"/>
+          <w:b w:val="0"/>
         </w:rPr>
-        <w:t>[Nombre del curso]</w:t>
+        <w:t>Aseguramiento de la Calidad del Software</w:t>
       </w:r>
     </w:p>
     <w:p>
@@ -4781,9 +4779,8 @@
       <w:r>
         <w:rPr>
           <w:b w:val="0"/>
-          <w:i w:val="0"/>
         </w:rPr>
-        <w:t>Se ejecutó con Newman (3 iteraciones). Cada iteración usa productos distintos del catálogo (pm.info.iteration).</w:t>
+        <w:t>La colección se ejecutó en el Collection Runner de la app de escritorio de Postman y también con Newman desde consola, con 3 iteraciones en ambos casos. Cada iteración usa productos distintos del catálogo (pm.info.iteration). Los dos ejecutores dieron el mismo resultado: 360 pruebas, 321 aprobadas, 39 fallidas y 0 errores de script. En el Runner la corrida tardó 21.5 s, con un tiempo promedio de respuesta de 201 ms.</w:t>
       </w:r>
     </w:p>
     <w:tbl>
@@ -5015,21 +5012,309 @@
     </w:tbl>
     <w:p/>
     <w:p>
+      <w:pPr>
+        <w:jc w:val="center"/>
+      </w:pPr>
+      <w:r>
+        <w:drawing>
+          <wp:inline xmlns:a="http://schemas.openxmlformats.org/drawingml/2006/main" xmlns:pic="http://schemas.openxmlformats.org/drawingml/2006/picture">
+            <wp:extent cx="5852160" cy="4558645"/>
+            <wp:docPr id="1" name="Picture 1"/>
+            <wp:cNvGraphicFramePr>
+              <a:graphicFrameLocks noChangeAspect="1"/>
+            </wp:cNvGraphicFramePr>
+            <a:graphic>
+              <a:graphicData uri="http://schemas.openxmlformats.org/drawingml/2006/picture">
+                <pic:pic>
+                  <pic:nvPicPr>
+                    <pic:cNvPr id="0" name="01_postman_runner_resumen.png"/>
+                    <pic:cNvPicPr/>
+                  </pic:nvPicPr>
+                  <pic:blipFill>
+                    <a:blip r:embed="rId9"/>
+                    <a:stretch>
+                      <a:fillRect/>
+                    </a:stretch>
+                  </pic:blipFill>
+                  <pic:spPr>
+                    <a:xfrm>
+                      <a:off x="0" y="0"/>
+                      <a:ext cx="5852160" cy="4558645"/>
+                    </a:xfrm>
+                    <a:prstGeom prst="rect"/>
+                  </pic:spPr>
+                </pic:pic>
+              </a:graphicData>
+            </a:graphic>
+          </wp:inline>
+        </w:drawing>
+      </w:r>
+    </w:p>
+    <w:p>
+      <w:pPr>
+        <w:jc w:val="center"/>
+      </w:pPr>
       <w:r>
         <w:rPr>
           <w:i/>
-          <w:highlight w:val="yellow"/>
+          <w:sz w:val="18"/>
         </w:rPr>
-        <w:t>[Insertar captura del Collection Runner de Postman con 3 iteraciones (resumen de pasadas y fallidas)]</w:t>
+        <w:t>Figura 1. Resumen del Collection Runner: 3 iteraciones, 360 pruebas, 321 aprobadas, 39 fallidas, 0 errores.</w:t>
       </w:r>
     </w:p>
     <w:p>
+      <w:pPr>
+        <w:jc w:val="center"/>
+      </w:pPr>
+      <w:r>
+        <w:drawing>
+          <wp:inline xmlns:a="http://schemas.openxmlformats.org/drawingml/2006/main" xmlns:pic="http://schemas.openxmlformats.org/drawingml/2006/picture">
+            <wp:extent cx="5486400" cy="4682402"/>
+            <wp:docPr id="2" name="Picture 2"/>
+            <wp:cNvGraphicFramePr>
+              <a:graphicFrameLocks noChangeAspect="1"/>
+            </wp:cNvGraphicFramePr>
+            <a:graphic>
+              <a:graphicData uri="http://schemas.openxmlformats.org/drawingml/2006/picture">
+                <pic:pic>
+                  <pic:nvPicPr>
+                    <pic:cNvPr id="0" name="02_postman_runner_fallas_iteracion1.png"/>
+                    <pic:cNvPicPr/>
+                  </pic:nvPicPr>
+                  <pic:blipFill>
+                    <a:blip r:embed="rId10"/>
+                    <a:stretch>
+                      <a:fillRect/>
+                    </a:stretch>
+                  </pic:blipFill>
+                  <pic:spPr>
+                    <a:xfrm>
+                      <a:off x="0" y="0"/>
+                      <a:ext cx="5486400" cy="4682402"/>
+                    </a:xfrm>
+                    <a:prstGeom prst="rect"/>
+                  </pic:spPr>
+                </pic:pic>
+              </a:graphicData>
+            </a:graphic>
+          </wp:inline>
+        </w:drawing>
+      </w:r>
+    </w:p>
+    <w:p>
+      <w:pPr>
+        <w:jc w:val="center"/>
+      </w:pPr>
       <w:r>
         <w:rPr>
           <w:i/>
-          <w:highlight w:val="yellow"/>
+          <w:sz w:val="18"/>
         </w:rPr>
-        <w:t>[Insertar captura del environment QA_API_LAB y de la estructura de carpetas de la colección]</w:t>
+        <w:t>Figura 2. Pruebas fallidas de la iteración 1 (TC-19, TC-12, TC-13, TC-14, TC-15). Cada falla indica el defecto asociado.</w:t>
+      </w:r>
+    </w:p>
+    <w:p>
+      <w:pPr>
+        <w:jc w:val="center"/>
+      </w:pPr>
+      <w:r>
+        <w:drawing>
+          <wp:inline xmlns:a="http://schemas.openxmlformats.org/drawingml/2006/main" xmlns:pic="http://schemas.openxmlformats.org/drawingml/2006/picture">
+            <wp:extent cx="4206240" cy="4171041"/>
+            <wp:docPr id="3" name="Picture 3"/>
+            <wp:cNvGraphicFramePr>
+              <a:graphicFrameLocks noChangeAspect="1"/>
+            </wp:cNvGraphicFramePr>
+            <a:graphic>
+              <a:graphicData uri="http://schemas.openxmlformats.org/drawingml/2006/picture">
+                <pic:pic>
+                  <pic:nvPicPr>
+                    <pic:cNvPr id="0" name="03_postman_runner_fallas_tc14_tc17.png"/>
+                    <pic:cNvPicPr/>
+                  </pic:nvPicPr>
+                  <pic:blipFill>
+                    <a:blip r:embed="rId11"/>
+                    <a:stretch>
+                      <a:fillRect/>
+                    </a:stretch>
+                  </pic:blipFill>
+                  <pic:spPr>
+                    <a:xfrm>
+                      <a:off x="0" y="0"/>
+                      <a:ext cx="4206240" cy="4171041"/>
+                    </a:xfrm>
+                    <a:prstGeom prst="rect"/>
+                  </pic:spPr>
+                </pic:pic>
+              </a:graphicData>
+            </a:graphic>
+          </wp:inline>
+        </w:drawing>
+      </w:r>
+    </w:p>
+    <w:p>
+      <w:pPr>
+        <w:jc w:val="center"/>
+      </w:pPr>
+      <w:r>
+        <w:rPr>
+          <w:i/>
+          <w:sz w:val="18"/>
+        </w:rPr>
+        <w:t>Figura 3. Pruebas fallidas de TC-14 a TC-17 (DEF-02 a DEF-06).</w:t>
+      </w:r>
+    </w:p>
+    <w:p>
+      <w:pPr>
+        <w:jc w:val="center"/>
+      </w:pPr>
+      <w:r>
+        <w:drawing>
+          <wp:inline xmlns:a="http://schemas.openxmlformats.org/drawingml/2006/main" xmlns:pic="http://schemas.openxmlformats.org/drawingml/2006/picture">
+            <wp:extent cx="5852160" cy="3054760"/>
+            <wp:docPr id="4" name="Picture 4"/>
+            <wp:cNvGraphicFramePr>
+              <a:graphicFrameLocks noChangeAspect="1"/>
+            </wp:cNvGraphicFramePr>
+            <a:graphic>
+              <a:graphicData uri="http://schemas.openxmlformats.org/drawingml/2006/picture">
+                <pic:pic>
+                  <pic:nvPicPr>
+                    <pic:cNvPr id="0" name="04_postman_environment_qa_api_lab.png"/>
+                    <pic:cNvPicPr/>
+                  </pic:nvPicPr>
+                  <pic:blipFill>
+                    <a:blip r:embed="rId12"/>
+                    <a:stretch>
+                      <a:fillRect/>
+                    </a:stretch>
+                  </pic:blipFill>
+                  <pic:spPr>
+                    <a:xfrm>
+                      <a:off x="0" y="0"/>
+                      <a:ext cx="5852160" cy="3054760"/>
+                    </a:xfrm>
+                    <a:prstGeom prst="rect"/>
+                  </pic:spPr>
+                </pic:pic>
+              </a:graphicData>
+            </a:graphic>
+          </wp:inline>
+        </w:drawing>
+      </w:r>
+    </w:p>
+    <w:p>
+      <w:pPr>
+        <w:jc w:val="center"/>
+      </w:pPr>
+      <w:r>
+        <w:rPr>
+          <w:i/>
+          <w:sz w:val="18"/>
+        </w:rPr>
+        <w:t>Figura 4. Environment QA_API_LAB después del run. password y token aparecen enmascarados; product_id, cart_id y expected_cart_total fueron guardados por los scripts (55.99 x 2 + 15.99 = 127.97).</w:t>
+      </w:r>
+    </w:p>
+    <w:p>
+      <w:pPr>
+        <w:jc w:val="center"/>
+      </w:pPr>
+      <w:r>
+        <w:drawing>
+          <wp:inline xmlns:a="http://schemas.openxmlformats.org/drawingml/2006/main" xmlns:pic="http://schemas.openxmlformats.org/drawingml/2006/picture">
+            <wp:extent cx="5852160" cy="1753754"/>
+            <wp:docPr id="5" name="Picture 5"/>
+            <wp:cNvGraphicFramePr>
+              <a:graphicFrameLocks noChangeAspect="1"/>
+            </wp:cNvGraphicFramePr>
+            <a:graphic>
+              <a:graphicData uri="http://schemas.openxmlformats.org/drawingml/2006/picture">
+                <pic:pic>
+                  <pic:nvPicPr>
+                    <pic:cNvPr id="0" name="05_postman_estructura_coleccion.png"/>
+                    <pic:cNvPicPr/>
+                  </pic:nvPicPr>
+                  <pic:blipFill>
+                    <a:blip r:embed="rId13"/>
+                    <a:stretch>
+                      <a:fillRect/>
+                    </a:stretch>
+                  </pic:blipFill>
+                  <pic:spPr>
+                    <a:xfrm>
+                      <a:off x="0" y="0"/>
+                      <a:ext cx="5852160" cy="1753754"/>
+                    </a:xfrm>
+                    <a:prstGeom prst="rect"/>
+                  </pic:spPr>
+                </pic:pic>
+              </a:graphicData>
+            </a:graphic>
+          </wp:inline>
+        </w:drawing>
+      </w:r>
+    </w:p>
+    <w:p>
+      <w:pPr>
+        <w:jc w:val="center"/>
+      </w:pPr>
+      <w:r>
+        <w:rPr>
+          <w:i/>
+          <w:sz w:val="18"/>
+        </w:rPr>
+        <w:t>Figura 5. Estructura de la colección: carpetas Catálogo, Carrito, Total, Checkout y Errores.</w:t>
+      </w:r>
+    </w:p>
+    <w:p>
+      <w:pPr>
+        <w:jc w:val="center"/>
+      </w:pPr>
+      <w:r>
+        <w:drawing>
+          <wp:inline xmlns:a="http://schemas.openxmlformats.org/drawingml/2006/main" xmlns:pic="http://schemas.openxmlformats.org/drawingml/2006/picture">
+            <wp:extent cx="5486400" cy="4257703"/>
+            <wp:docPr id="6" name="Picture 6"/>
+            <wp:cNvGraphicFramePr>
+              <a:graphicFrameLocks noChangeAspect="1"/>
+            </wp:cNvGraphicFramePr>
+            <a:graphic>
+              <a:graphicData uri="http://schemas.openxmlformats.org/drawingml/2006/picture">
+                <pic:pic>
+                  <pic:nvPicPr>
+                    <pic:cNvPr id="0" name="06_postman_tc01_consultar_catalogo.png"/>
+                    <pic:cNvPicPr/>
+                  </pic:nvPicPr>
+                  <pic:blipFill>
+                    <a:blip r:embed="rId14"/>
+                    <a:stretch>
+                      <a:fillRect/>
+                    </a:stretch>
+                  </pic:blipFill>
+                  <pic:spPr>
+                    <a:xfrm>
+                      <a:off x="0" y="0"/>
+                      <a:ext cx="5486400" cy="4257703"/>
+                    </a:xfrm>
+                    <a:prstGeom prst="rect"/>
+                  </pic:spPr>
+                </pic:pic>
+              </a:graphicData>
+            </a:graphic>
+          </wp:inline>
+        </w:drawing>
+      </w:r>
+    </w:p>
+    <w:p>
+      <w:pPr>
+        <w:jc w:val="center"/>
+      </w:pPr>
+      <w:r>
+        <w:rPr>
+          <w:i/>
+          <w:sz w:val="18"/>
+        </w:rPr>
+        <w:t>Figura 6. Ejecución individual de TC-01 Consultar catálogo: 200 OK con la lista de productos en JSON.</w:t>
       </w:r>
     </w:p>
     <w:p>
@@ -5418,12 +5703,54 @@
       </w:r>
     </w:p>
     <w:p>
+      <w:pPr>
+        <w:jc w:val="center"/>
+      </w:pPr>
+      <w:r>
+        <w:drawing>
+          <wp:inline xmlns:a="http://schemas.openxmlformats.org/drawingml/2006/main" xmlns:pic="http://schemas.openxmlformats.org/drawingml/2006/picture">
+            <wp:extent cx="5943600" cy="1074041"/>
+            <wp:docPr id="7" name="Picture 7"/>
+            <wp:cNvGraphicFramePr>
+              <a:graphicFrameLocks noChangeAspect="1"/>
+            </wp:cNvGraphicFramePr>
+            <a:graphic>
+              <a:graphicData uri="http://schemas.openxmlformats.org/drawingml/2006/picture">
+                <pic:pic>
+                  <pic:nvPicPr>
+                    <pic:cNvPr id="0" name="07_pytest_resumen.png"/>
+                    <pic:cNvPicPr/>
+                  </pic:nvPicPr>
+                  <pic:blipFill>
+                    <a:blip r:embed="rId15"/>
+                    <a:stretch>
+                      <a:fillRect/>
+                    </a:stretch>
+                  </pic:blipFill>
+                  <pic:spPr>
+                    <a:xfrm>
+                      <a:off x="0" y="0"/>
+                      <a:ext cx="5943600" cy="1074041"/>
+                    </a:xfrm>
+                    <a:prstGeom prst="rect"/>
+                  </pic:spPr>
+                </pic:pic>
+              </a:graphicData>
+            </a:graphic>
+          </wp:inline>
+        </w:drawing>
+      </w:r>
+    </w:p>
+    <w:p>
+      <w:pPr>
+        <w:jc w:val="center"/>
+      </w:pPr>
       <w:r>
         <w:rPr>
           <w:i/>
-          <w:highlight w:val="yellow"/>
+          <w:sz w:val="18"/>
         </w:rPr>
-        <w:t>[Insertar captura de la terminal con la ejecución de Pytest]</w:t>
+        <w:t>Figura 7. Resumen de la ejecución de Pytest: 42 aprobadas y 13 xfail, cada una con su defecto.</w:t>
       </w:r>
     </w:p>
     <w:p>
@@ -8479,6 +8806,20 @@
       </w:r>
       <w:r>
         <w:t>el checkout actual llama primero a la API y luego guarda localmente; en producción convendría un estado "pendiente" local antes de llamar al proveedor (patrón outbox) para no perder órdenes.</w:t>
+      </w:r>
+    </w:p>
+    <w:p>
+      <w:pPr>
+        <w:pStyle w:val="ListBullet"/>
+      </w:pPr>
+      <w:r>
+        <w:rPr>
+          <w:b/>
+        </w:rPr>
+        <w:t xml:space="preserve">Bloqueo desde la nube: </w:t>
+      </w:r>
+      <w:r>
+        <w:t>la primera corrida del Runner se hizo con el Cloud Agent de Postman, que envía los requests desde servidores de Postman. Cloudflare, que protege a FakeStore, respondió 403 con una página HTML a casi todos los requests, y aparecieron 36 errores de script. Desde la app de escritorio, que envía los requests desde el equipo local, todo funcionó. Es importante para ejecutar las pruebas en un CI en la nube: hay que usar un runner propio o confirmar que el proveedor permite ese tráfico.</w:t>
       </w:r>
     </w:p>
     <w:p>

</xml_diff>

<commit_message>
Agrega integrantes y carnés al reporte y README
- Portada con Ben Farz y Josué Calderón y sus carnés
- Sección de integrantes en el README
- Autor del documento actualizado y PDF exportado de nuevo
</commit_message>
<xml_diff>
--- a/docs/Reporte_Laboratorio_7.docx
+++ b/docs/Reporte_Laboratorio_7.docx
@@ -75,19 +75,32 @@
     <w:p/>
     <w:p>
       <w:pPr>
+        <w:spacing w:after="0"/>
         <w:jc w:val="center"/>
       </w:pPr>
       <w:r>
         <w:rPr>
           <w:b/>
         </w:rPr>
-        <w:t xml:space="preserve">Integrante: </w:t>
+        <w:t>Integrantes:</w:t>
       </w:r>
+    </w:p>
+    <w:p>
+      <w:pPr>
+        <w:spacing w:after="0"/>
+        <w:jc w:val="center"/>
+      </w:pPr>
       <w:r>
-        <w:rPr>
-          <w:b w:val="0"/>
-        </w:rPr>
-        <w:t>Josué Calderón</w:t>
+        <w:t>Ben Farz - Carné 2023121041</w:t>
+      </w:r>
+    </w:p>
+    <w:p>
+      <w:pPr>
+        <w:spacing/>
+        <w:jc w:val="center"/>
+      </w:pPr>
+      <w:r>
+        <w:t>Josué Calderón - Carné 2023380883</w:t>
       </w:r>
     </w:p>
     <w:p>

</xml_diff>